<commit_message>
added variables maxdischarge: maximimum discharge of a day (of all substeps) and avgdischarge of a day (of all substeps)
Some changes in the documentation
</commit_message>
<xml_diff>
--- a/Toolkit/documentation/README.docx
+++ b/Toolkit/documentation/README.docx
@@ -1,6 +1,6 @@
 
 <file path=word/document.xml><?xml version="1.0" encoding="utf-8"?>
-<w:document xmlns:wpc="http://schemas.microsoft.com/office/word/2010/wordprocessingCanvas" xmlns:cx="http://schemas.microsoft.com/office/drawing/2014/chartex" xmlns:cx1="http://schemas.microsoft.com/office/drawing/2015/9/8/chartex" xmlns:cx2="http://schemas.microsoft.com/office/drawing/2015/10/21/chartex" xmlns:cx3="http://schemas.microsoft.com/office/drawing/2016/5/9/chartex" xmlns:cx4="http://schemas.microsoft.com/office/drawing/2016/5/10/chartex" xmlns:cx5="http://schemas.microsoft.com/office/drawing/2016/5/11/chartex" xmlns:cx6="http://schemas.microsoft.com/office/drawing/2016/5/12/chartex" xmlns:cx7="http://schemas.microsoft.com/office/drawing/2016/5/13/chartex" xmlns:cx8="http://schemas.microsoft.com/office/drawing/2016/5/14/chartex" xmlns:mc="http://schemas.openxmlformats.org/markup-compatibility/2006" xmlns:aink="http://schemas.microsoft.com/office/drawing/2016/ink" xmlns:am3d="http://schemas.microsoft.com/office/drawing/2017/model3d" xmlns:o="urn:schemas-microsoft-com:office:office" xmlns:oel="http://schemas.microsoft.com/office/2019/extlst" xmlns:r="http://schemas.openxmlformats.org/officeDocument/2006/relationships" xmlns:m="http://schemas.openxmlformats.org/officeDocument/2006/math" xmlns:v="urn:schemas-microsoft-com:vml" xmlns:wp14="http://schemas.microsoft.com/office/word/2010/wordprocessingDrawing" xmlns:wp="http://schemas.openxmlformats.org/drawingml/2006/wordprocessingDrawing" xmlns:w10="urn:schemas-microsoft-com:office:word" xmlns:w="http://schemas.openxmlformats.org/wordprocessingml/2006/main" xmlns:w14="http://schemas.microsoft.com/office/word/2010/wordml" xmlns:w15="http://schemas.microsoft.com/office/word/2012/wordml" xmlns:w16cex="http://schemas.microsoft.com/office/word/2018/wordml/cex" xmlns:w16cid="http://schemas.microsoft.com/office/word/2016/wordml/cid" xmlns:w16="http://schemas.microsoft.com/office/word/2018/wordml" xmlns:w16sdtdh="http://schemas.microsoft.com/office/word/2020/wordml/sdtdatahash" xmlns:w16se="http://schemas.microsoft.com/office/word/2015/wordml/symex" xmlns:wpg="http://schemas.microsoft.com/office/word/2010/wordprocessingGroup" xmlns:wpi="http://schemas.microsoft.com/office/word/2010/wordprocessingInk" xmlns:wne="http://schemas.microsoft.com/office/word/2006/wordml" xmlns:wps="http://schemas.microsoft.com/office/word/2010/wordprocessingShape" mc:Ignorable="w14 w15 w16se w16cid w16 w16cex w16sdtdh wp14">
+<w:document xmlns:wpc="http://schemas.microsoft.com/office/word/2010/wordprocessingCanvas" xmlns:cx="http://schemas.microsoft.com/office/drawing/2014/chartex" xmlns:cx1="http://schemas.microsoft.com/office/drawing/2015/9/8/chartex" xmlns:cx2="http://schemas.microsoft.com/office/drawing/2015/10/21/chartex" xmlns:cx3="http://schemas.microsoft.com/office/drawing/2016/5/9/chartex" xmlns:cx4="http://schemas.microsoft.com/office/drawing/2016/5/10/chartex" xmlns:cx5="http://schemas.microsoft.com/office/drawing/2016/5/11/chartex" xmlns:cx6="http://schemas.microsoft.com/office/drawing/2016/5/12/chartex" xmlns:cx7="http://schemas.microsoft.com/office/drawing/2016/5/13/chartex" xmlns:cx8="http://schemas.microsoft.com/office/drawing/2016/5/14/chartex" xmlns:mc="http://schemas.openxmlformats.org/markup-compatibility/2006" xmlns:aink="http://schemas.microsoft.com/office/drawing/2016/ink" xmlns:am3d="http://schemas.microsoft.com/office/drawing/2017/model3d" xmlns:o="urn:schemas-microsoft-com:office:office" xmlns:oel="http://schemas.microsoft.com/office/2019/extlst" xmlns:r="http://schemas.openxmlformats.org/officeDocument/2006/relationships" xmlns:m="http://schemas.openxmlformats.org/officeDocument/2006/math" xmlns:v="urn:schemas-microsoft-com:vml" xmlns:wp14="http://schemas.microsoft.com/office/word/2010/wordprocessingDrawing" xmlns:wp="http://schemas.openxmlformats.org/drawingml/2006/wordprocessingDrawing" xmlns:w10="urn:schemas-microsoft-com:office:word" xmlns:w="http://schemas.openxmlformats.org/wordprocessingml/2006/main" xmlns:w14="http://schemas.microsoft.com/office/word/2010/wordml" xmlns:w15="http://schemas.microsoft.com/office/word/2012/wordml" xmlns:w16cex="http://schemas.microsoft.com/office/word/2018/wordml/cex" xmlns:w16cid="http://schemas.microsoft.com/office/word/2016/wordml/cid" xmlns:w16="http://schemas.microsoft.com/office/word/2018/wordml" xmlns:w16du="http://schemas.microsoft.com/office/word/2023/wordml/word16du" xmlns:w16sdtdh="http://schemas.microsoft.com/office/word/2020/wordml/sdtdatahash" xmlns:w16sdtfl="http://schemas.microsoft.com/office/word/2024/wordml/sdtformatlock" xmlns:w16se="http://schemas.microsoft.com/office/word/2015/wordml/symex" xmlns:wpg="http://schemas.microsoft.com/office/word/2010/wordprocessingGroup" xmlns:wpi="http://schemas.microsoft.com/office/word/2010/wordprocessingInk" xmlns:wne="http://schemas.microsoft.com/office/word/2006/wordml" xmlns:wps="http://schemas.microsoft.com/office/word/2010/wordprocessingShape" mc:Ignorable="w14 w15 w16se w16cid w16 w16cex w16sdtdh w16sdtfl w16du wp14">
   <w:body>
     <w:p>
       <w:pPr>
@@ -121,6 +121,7 @@
           <w:lang w:val="de-DE"/>
         </w:rPr>
       </w:pPr>
+      <w:proofErr w:type="spellStart"/>
       <w:r>
         <w:rPr>
           <w:rFonts w:ascii="Consolas" w:eastAsia="Times New Roman" w:hAnsi="Consolas" w:cs="Courier New"/>
@@ -132,6 +133,7 @@
         </w:rPr>
         <w:t>pip</w:t>
       </w:r>
+      <w:proofErr w:type="spellEnd"/>
       <w:r>
         <w:rPr>
           <w:rFonts w:ascii="Consolas" w:eastAsia="Times New Roman" w:hAnsi="Consolas" w:cs="Courier New"/>
@@ -143,6 +145,7 @@
         </w:rPr>
         <w:t xml:space="preserve"> </w:t>
       </w:r>
+      <w:proofErr w:type="spellStart"/>
       <w:r>
         <w:rPr>
           <w:rFonts w:ascii="Consolas" w:eastAsia="Times New Roman" w:hAnsi="Consolas" w:cs="Courier New"/>
@@ -154,6 +157,7 @@
         </w:rPr>
         <w:t>install</w:t>
       </w:r>
+      <w:proofErr w:type="spellEnd"/>
       <w:r>
         <w:rPr>
           <w:rFonts w:ascii="Consolas" w:eastAsia="Times New Roman" w:hAnsi="Consolas" w:cs="Courier New"/>
@@ -187,6 +191,7 @@
         </w:rPr>
         <w:t xml:space="preserve"> </w:t>
       </w:r>
+      <w:proofErr w:type="spellStart"/>
       <w:r>
         <w:rPr>
           <w:rFonts w:ascii="Consolas" w:eastAsia="Times New Roman" w:hAnsi="Consolas" w:cs="Courier New"/>
@@ -198,6 +203,7 @@
         </w:rPr>
         <w:t>sphinx</w:t>
       </w:r>
+      <w:proofErr w:type="spellEnd"/>
     </w:p>
     <w:p>
       <w:pPr>
@@ -215,11 +221,19 @@
           <w:lang w:val="de-DE"/>
         </w:rPr>
       </w:pPr>
+      <w:proofErr w:type="spellStart"/>
       <w:r>
         <w:rPr>
           <w:lang w:val="de-DE"/>
         </w:rPr>
-        <w:t xml:space="preserve">Graphviz: </w:t>
+        <w:t>Graphviz</w:t>
+      </w:r>
+      <w:proofErr w:type="spellEnd"/>
+      <w:r>
+        <w:rPr>
+          <w:lang w:val="de-DE"/>
+        </w:rPr>
+        <w:t xml:space="preserve">: </w:t>
       </w:r>
       <w:hyperlink r:id="rId5" w:history="1">
         <w:r>
@@ -328,6 +342,7 @@
         </w:rPr>
         <w:t xml:space="preserve"> </w:t>
       </w:r>
+      <w:proofErr w:type="spellStart"/>
       <w:r>
         <w:rPr>
           <w:rFonts w:ascii="Consolas" w:eastAsia="Times New Roman" w:hAnsi="Consolas" w:cs="Courier New"/>
@@ -338,6 +353,7 @@
         </w:rPr>
         <w:t>graphviz</w:t>
       </w:r>
+      <w:proofErr w:type="spellEnd"/>
     </w:p>
     <w:p>
       <w:pPr>
@@ -433,7 +449,29 @@
           <w:sz w:val="27"/>
           <w:szCs w:val="27"/>
         </w:rPr>
-        <w:t>sphinx-rtd-theme</w:t>
+        <w:t>sphinx-</w:t>
+      </w:r>
+      <w:proofErr w:type="spellStart"/>
+      <w:r>
+        <w:rPr>
+          <w:rFonts w:ascii="Consolas" w:eastAsia="Times New Roman" w:hAnsi="Consolas" w:cs="Courier New"/>
+          <w:color w:val="333333"/>
+          <w:spacing w:val="4"/>
+          <w:sz w:val="27"/>
+          <w:szCs w:val="27"/>
+        </w:rPr>
+        <w:t>rtd</w:t>
+      </w:r>
+      <w:proofErr w:type="spellEnd"/>
+      <w:r>
+        <w:rPr>
+          <w:rFonts w:ascii="Consolas" w:eastAsia="Times New Roman" w:hAnsi="Consolas" w:cs="Courier New"/>
+          <w:color w:val="333333"/>
+          <w:spacing w:val="4"/>
+          <w:sz w:val="27"/>
+          <w:szCs w:val="27"/>
+        </w:rPr>
+        <w:t>-theme</w:t>
       </w:r>
     </w:p>
     <w:p>
@@ -506,7 +544,15 @@
         <w:spacing w:after="0"/>
       </w:pPr>
       <w:r>
-        <w:t>*.rst:</w:t>
+        <w:t>*.</w:t>
+      </w:r>
+      <w:proofErr w:type="spellStart"/>
+      <w:r>
+        <w:t>rst</w:t>
+      </w:r>
+      <w:proofErr w:type="spellEnd"/>
+      <w:r>
+        <w:t>:</w:t>
       </w:r>
       <w:r>
         <w:tab/>
@@ -514,9 +560,11 @@
       <w:r>
         <w:tab/>
       </w:r>
+      <w:proofErr w:type="spellStart"/>
       <w:r>
         <w:t>reStructuredText</w:t>
       </w:r>
+      <w:proofErr w:type="spellEnd"/>
       <w:r>
         <w:t xml:space="preserve"> files</w:t>
       </w:r>
@@ -551,9 +599,11 @@
       <w:pPr>
         <w:pStyle w:val="Heading1"/>
       </w:pPr>
+      <w:proofErr w:type="spellStart"/>
       <w:r>
         <w:t>reStructuredText</w:t>
       </w:r>
+      <w:proofErr w:type="spellEnd"/>
     </w:p>
     <w:p>
       <w:pPr>
@@ -627,6 +677,7 @@
       <w:pPr>
         <w:spacing w:after="0"/>
       </w:pPr>
+      <w:proofErr w:type="spellStart"/>
       <w:r>
         <w:rPr>
           <w:b/>
@@ -634,8 +685,9 @@
           <w:sz w:val="20"/>
           <w:szCs w:val="20"/>
         </w:rPr>
-        <w:t>sys.path.insert(0, os.path.abspath('..</w:t>
-      </w:r>
+        <w:t>sys.path.insert</w:t>
+      </w:r>
+      <w:proofErr w:type="spellEnd"/>
       <w:r>
         <w:rPr>
           <w:b/>
@@ -643,8 +695,9 @@
           <w:sz w:val="20"/>
           <w:szCs w:val="20"/>
         </w:rPr>
-        <w:t>/..</w:t>
-      </w:r>
+        <w:t xml:space="preserve">(0, </w:t>
+      </w:r>
+      <w:proofErr w:type="spellStart"/>
       <w:r>
         <w:rPr>
           <w:b/>
@@ -652,32 +705,18 @@
           <w:sz w:val="20"/>
           <w:szCs w:val="20"/>
         </w:rPr>
-        <w:t>'))</w:t>
-      </w:r>
-    </w:p>
-    <w:p>
-      <w:pPr>
-        <w:spacing w:after="0"/>
-      </w:pPr>
-    </w:p>
-    <w:p>
-      <w:pPr>
-        <w:spacing w:after="0"/>
-      </w:pPr>
-      <w:r>
-        <w:t>This can be updated as necessary, for example:</w:t>
-      </w:r>
-    </w:p>
-    <w:p>
-      <w:pPr>
-        <w:spacing w:after="0"/>
+        <w:t>os.path.abspath</w:t>
+      </w:r>
+      <w:proofErr w:type="spellEnd"/>
+      <w:r>
         <w:rPr>
           <w:b/>
           <w:bCs/>
           <w:sz w:val="20"/>
           <w:szCs w:val="20"/>
         </w:rPr>
-      </w:pPr>
+        <w:t>('..</w:t>
+      </w:r>
       <w:r>
         <w:rPr>
           <w:b/>
@@ -685,25 +724,104 @@
           <w:sz w:val="20"/>
           <w:szCs w:val="20"/>
         </w:rPr>
-        <w:t>sys.path.insert(0, os.path.abspath('C:/work/CWATM'))</w:t>
-      </w:r>
-    </w:p>
-    <w:p>
-      <w:pPr>
-        <w:spacing w:after="0"/>
-      </w:pPr>
-    </w:p>
-    <w:p>
-      <w:pPr>
-        <w:spacing w:after="0"/>
-      </w:pPr>
-    </w:p>
-    <w:p>
-      <w:pPr>
-        <w:spacing w:after="0"/>
-      </w:pPr>
-      <w:r>
-        <w:t>Some path to cwatm figure folders in _static</w:t>
+        <w:t>/..</w:t>
+      </w:r>
+      <w:r>
+        <w:rPr>
+          <w:b/>
+          <w:bCs/>
+          <w:sz w:val="20"/>
+          <w:szCs w:val="20"/>
+        </w:rPr>
+        <w:t>'))</w:t>
+      </w:r>
+    </w:p>
+    <w:p>
+      <w:pPr>
+        <w:spacing w:after="0"/>
+      </w:pPr>
+    </w:p>
+    <w:p>
+      <w:pPr>
+        <w:spacing w:after="0"/>
+      </w:pPr>
+      <w:r>
+        <w:t>This can be updated as necessary, for example:</w:t>
+      </w:r>
+    </w:p>
+    <w:p>
+      <w:pPr>
+        <w:spacing w:after="0"/>
+        <w:rPr>
+          <w:b/>
+          <w:bCs/>
+          <w:sz w:val="20"/>
+          <w:szCs w:val="20"/>
+        </w:rPr>
+      </w:pPr>
+      <w:proofErr w:type="spellStart"/>
+      <w:r>
+        <w:rPr>
+          <w:b/>
+          <w:bCs/>
+          <w:sz w:val="20"/>
+          <w:szCs w:val="20"/>
+        </w:rPr>
+        <w:t>sys.path.insert</w:t>
+      </w:r>
+      <w:proofErr w:type="spellEnd"/>
+      <w:r>
+        <w:rPr>
+          <w:b/>
+          <w:bCs/>
+          <w:sz w:val="20"/>
+          <w:szCs w:val="20"/>
+        </w:rPr>
+        <w:t xml:space="preserve">(0, </w:t>
+      </w:r>
+      <w:proofErr w:type="spellStart"/>
+      <w:r>
+        <w:rPr>
+          <w:b/>
+          <w:bCs/>
+          <w:sz w:val="20"/>
+          <w:szCs w:val="20"/>
+        </w:rPr>
+        <w:t>os.path.abspath</w:t>
+      </w:r>
+      <w:proofErr w:type="spellEnd"/>
+      <w:r>
+        <w:rPr>
+          <w:b/>
+          <w:bCs/>
+          <w:sz w:val="20"/>
+          <w:szCs w:val="20"/>
+        </w:rPr>
+        <w:t>('C:/work/CWATM'))</w:t>
+      </w:r>
+    </w:p>
+    <w:p>
+      <w:pPr>
+        <w:spacing w:after="0"/>
+      </w:pPr>
+    </w:p>
+    <w:p>
+      <w:pPr>
+        <w:spacing w:after="0"/>
+      </w:pPr>
+    </w:p>
+    <w:p>
+      <w:pPr>
+        <w:spacing w:after="0"/>
+      </w:pPr>
+      <w:r>
+        <w:t xml:space="preserve">Some path to </w:t>
+      </w:r>
+      <w:r>
+        <w:t>CWatM</w:t>
+      </w:r>
+      <w:r>
+        <w:t xml:space="preserve"> figure folders in _static</w:t>
       </w:r>
     </w:p>
     <w:sectPr>
@@ -717,7 +835,7 @@
 </file>
 
 <file path=word/styles.xml><?xml version="1.0" encoding="utf-8"?>
-<w:styles xmlns:mc="http://schemas.openxmlformats.org/markup-compatibility/2006" xmlns:r="http://schemas.openxmlformats.org/officeDocument/2006/relationships" xmlns:w="http://schemas.openxmlformats.org/wordprocessingml/2006/main" xmlns:w14="http://schemas.microsoft.com/office/word/2010/wordml" xmlns:w15="http://schemas.microsoft.com/office/word/2012/wordml" xmlns:w16cex="http://schemas.microsoft.com/office/word/2018/wordml/cex" xmlns:w16cid="http://schemas.microsoft.com/office/word/2016/wordml/cid" xmlns:w16="http://schemas.microsoft.com/office/word/2018/wordml" xmlns:w16sdtdh="http://schemas.microsoft.com/office/word/2020/wordml/sdtdatahash" xmlns:w16se="http://schemas.microsoft.com/office/word/2015/wordml/symex" mc:Ignorable="w14 w15 w16se w16cid w16 w16cex w16sdtdh">
+<w:styles xmlns:mc="http://schemas.openxmlformats.org/markup-compatibility/2006" xmlns:r="http://schemas.openxmlformats.org/officeDocument/2006/relationships" xmlns:w="http://schemas.openxmlformats.org/wordprocessingml/2006/main" xmlns:w14="http://schemas.microsoft.com/office/word/2010/wordml" xmlns:w15="http://schemas.microsoft.com/office/word/2012/wordml" xmlns:w16cex="http://schemas.microsoft.com/office/word/2018/wordml/cex" xmlns:w16cid="http://schemas.microsoft.com/office/word/2016/wordml/cid" xmlns:w16="http://schemas.microsoft.com/office/word/2018/wordml" xmlns:w16du="http://schemas.microsoft.com/office/word/2023/wordml/word16du" xmlns:w16sdtdh="http://schemas.microsoft.com/office/word/2020/wordml/sdtdatahash" xmlns:w16sdtfl="http://schemas.microsoft.com/office/word/2024/wordml/sdtformatlock" xmlns:w16se="http://schemas.microsoft.com/office/word/2015/wordml/symex" mc:Ignorable="w14 w15 w16se w16cid w16 w16cex w16sdtdh w16sdtfl w16du">
   <w:docDefaults>
     <w:rPrDefault>
       <w:rPr>

</xml_diff>